<commit_message>
docs: update SDD to v1.3 + Tasks Plan to v1.1 - enterprise DIP (IApplicationDbContext etc.), project invite in Project Service Phase 2, IBrevoEmailService, workspace vs project, BuildHost, no internal CSS
</commit_message>
<xml_diff>
--- a/Documents/FlowBoard_System_Design.docx
+++ b/Documents/FlowBoard_System_Design.docx
@@ -95,7 +95,7 @@
                 <w:rFonts w:ascii="Calibri" w:hAnsi="Calibri"/>
                 <w:sz w:val="16"/>
               </w:rPr>
-              <w:t>1.2  •  Angular 22 + .NET 10 + TanStack Query + Signals</w:t>
+              <w:t>1.3  •  Angular 22 + .NET 10 + Enterprise Clean Architecture (DIP)</w:t>
             </w:r>
           </w:p>
         </w:tc>
@@ -198,9 +198,9 @@
             <w:r>
               <w:rPr>
                 <w:rFonts w:ascii="Calibri" w:hAnsi="Calibri"/>
-                <w:sz w:val="16"/>
-              </w:rPr>
-              <w:t>Angular 22 + .NET 10 + YARP 2.3 + CloudAMQP + Upstash Redis + Cloudinary + Brevo + Gemini 2.5 Flash + MonsterASP.net + Vercel</w:t>
+                <w:sz w:val="14"/>
+              </w:rPr>
+              <w:t>Angular 22 + .NET 10 + YARP 2.3 + Clean Architecture (IApplicationDbContext, IJwtProvider, IBrevoEmailService) + Upstash + CloudAMQP + Cloudinary + Brevo + Gemini + MonsterASP.net + Vercel</w:t>
             </w:r>
           </w:p>
         </w:tc>
@@ -25117,6 +25117,908 @@
         <w:t>— End of Document v1.2 —  Angular 22 + .NET 10 + TanStack Query + Signals + DaisyUI + Gemini + Brevo + Same Keys Local/Prod  •  Ready for Task-by-Task Build —</w:t>
       </w:r>
     </w:p>
+    <w:p>
+      <w:r>
+        <w:br w:type="page"/>
+      </w:r>
+    </w:p>
+    <w:p>
+      <w:pPr>
+        <w:pStyle w:val="Heading1"/>
+      </w:pPr>
+      <w:r>
+        <w:rPr>
+          <w:rFonts w:ascii="Calibri" w:hAnsi="Calibri"/>
+          <w:b/>
+          <w:color w:val="1F3864"/>
+          <w:sz w:val="28"/>
+        </w:rPr>
+        <w:t>Appendix 24: Enterprise Update v1.3 - Production-Grade Clean Architecture (DIP)</w:t>
+      </w:r>
+    </w:p>
+    <w:p>
+      <w:r>
+        <w:rPr>
+          <w:rFonts w:ascii="Calibri" w:hAnsi="Calibri"/>
+          <w:i/>
+          <w:sz w:val="16"/>
+        </w:rPr>
+        <w:t>This section documents the enterprise refactoring applied after Task 1.2 (as per discussion on 04 Sep 2026) to make the project interview-proof. All changes keep the same stack (Angular 22 + .NET 10) but add strict Clean Architecture with Dependency Inversion.</w:t>
+      </w:r>
+    </w:p>
+    <w:tbl>
+      <w:tblPr>
+        <w:tblStyle w:val="LightGrid-Accent1"/>
+        <w:tblW w:type="auto" w:w="0"/>
+        <w:jc w:val="center"/>
+        <w:tblLayout w:type="fixed"/>
+        <w:tblLook w:firstColumn="1" w:firstRow="1" w:lastColumn="0" w:lastRow="0" w:noHBand="0" w:noVBand="1" w:val="04A0"/>
+        <w:tblInd w:w="300" w:type="dxa"/>
+        <w:tblCellMar>
+          <w:top w:w="60" w:type="dxa"/>
+          <w:left w:w="80" w:type="dxa"/>
+          <w:bottom w:w="60" w:type="dxa"/>
+          <w:right w:w="80" w:type="dxa"/>
+        </w:tblCellMar>
+      </w:tblPr>
+      <w:tblGrid>
+        <w:gridCol w:w="2016"/>
+        <w:gridCol w:w="2592"/>
+        <w:gridCol w:w="4032"/>
+      </w:tblGrid>
+      <w:tr>
+        <w:tc>
+          <w:tcPr>
+            <w:tcW w:type="dxa" w:w="3400"/>
+            <w:vAlign w:val="center"/>
+            <w:shd w:fill="1F3864" w:val="clear"/>
+          </w:tcPr>
+          <w:p>
+            <w:pPr>
+              <w:jc w:val="center"/>
+            </w:pPr>
+            <w:r/>
+            <w:r>
+              <w:rPr>
+                <w:rFonts w:ascii="Calibri" w:hAnsi="Calibri"/>
+                <w:b/>
+                <w:color w:val="FFFFFF"/>
+                <w:sz w:val="14"/>
+              </w:rPr>
+              <w:t>Area</w:t>
+            </w:r>
+          </w:p>
+        </w:tc>
+        <w:tc>
+          <w:tcPr>
+            <w:tcW w:type="dxa" w:w="3400"/>
+            <w:vAlign w:val="center"/>
+            <w:shd w:fill="1F3864" w:val="clear"/>
+          </w:tcPr>
+          <w:p>
+            <w:pPr>
+              <w:jc w:val="center"/>
+            </w:pPr>
+            <w:r/>
+            <w:r>
+              <w:rPr>
+                <w:rFonts w:ascii="Calibri" w:hAnsi="Calibri"/>
+                <w:b/>
+                <w:color w:val="FFFFFF"/>
+                <w:sz w:val="14"/>
+              </w:rPr>
+              <w:t>Before (Pragmatic)</w:t>
+            </w:r>
+          </w:p>
+        </w:tc>
+        <w:tc>
+          <w:tcPr>
+            <w:tcW w:type="dxa" w:w="3400"/>
+            <w:vAlign w:val="center"/>
+            <w:shd w:fill="1F3864" w:val="clear"/>
+          </w:tcPr>
+          <w:p>
+            <w:pPr>
+              <w:jc w:val="center"/>
+            </w:pPr>
+            <w:r/>
+            <w:r>
+              <w:rPr>
+                <w:rFonts w:ascii="Calibri" w:hAnsi="Calibri"/>
+                <w:b/>
+                <w:color w:val="FFFFFF"/>
+                <w:sz w:val="14"/>
+              </w:rPr>
+              <w:t>After (Enterprise v1.3 - Production-Grade)</w:t>
+            </w:r>
+          </w:p>
+        </w:tc>
+      </w:tr>
+      <w:tr>
+        <w:tc>
+          <w:tcPr>
+            <w:tcW w:type="dxa" w:w="2016"/>
+            <w:vAlign w:val="center"/>
+          </w:tcPr>
+          <w:p>
+            <w:pPr>
+              <w:jc w:val="left"/>
+            </w:pPr>
+            <w:r/>
+            <w:r>
+              <w:rPr>
+                <w:rFonts w:ascii="Calibri" w:hAnsi="Calibri"/>
+                <w:b/>
+                <w:color w:val="333333"/>
+                <w:sz w:val="13"/>
+              </w:rPr>
+              <w:t>Application -&gt; Infrastructure</w:t>
+            </w:r>
+          </w:p>
+        </w:tc>
+        <w:tc>
+          <w:tcPr>
+            <w:tcW w:type="dxa" w:w="2592"/>
+            <w:vAlign w:val="center"/>
+          </w:tcPr>
+          <w:p>
+            <w:pPr>
+              <w:jc w:val="left"/>
+            </w:pPr>
+            <w:r/>
+            <w:r>
+              <w:rPr>
+                <w:rFonts w:ascii="Calibri" w:hAnsi="Calibri"/>
+                <w:color w:val="333333"/>
+                <w:sz w:val="13"/>
+              </w:rPr>
+              <w:t>Handlers injected concrete IdentityDbContext + JwtProvider</w:t>
+            </w:r>
+          </w:p>
+        </w:tc>
+        <w:tc>
+          <w:tcPr>
+            <w:tcW w:type="dxa" w:w="4032"/>
+            <w:vAlign w:val="center"/>
+          </w:tcPr>
+          <w:p>
+            <w:pPr>
+              <w:jc w:val="left"/>
+            </w:pPr>
+            <w:r/>
+            <w:r>
+              <w:rPr>
+                <w:rFonts w:ascii="Calibri" w:hAnsi="Calibri"/>
+                <w:color w:val="333333"/>
+                <w:sz w:val="13"/>
+              </w:rPr>
+              <w:t>Handlers inject IApplicationDbContext + IJwtProvider + IPasswordHasher + IRefreshTokenService (interfaces defined in Application, implemented in Infrastructure)</w:t>
+            </w:r>
+          </w:p>
+        </w:tc>
+      </w:tr>
+      <w:tr>
+        <w:tc>
+          <w:tcPr>
+            <w:tcW w:type="dxa" w:w="2016"/>
+            <w:vAlign w:val="center"/>
+          </w:tcPr>
+          <w:p>
+            <w:pPr>
+              <w:jc w:val="left"/>
+            </w:pPr>
+            <w:r/>
+            <w:r>
+              <w:rPr>
+                <w:rFonts w:ascii="Calibri" w:hAnsi="Calibri"/>
+                <w:b/>
+                <w:color w:val="333333"/>
+                <w:sz w:val="13"/>
+              </w:rPr>
+              <w:t>DbContext</w:t>
+            </w:r>
+          </w:p>
+        </w:tc>
+        <w:tc>
+          <w:tcPr>
+            <w:tcW w:type="dxa" w:w="2592"/>
+            <w:vAlign w:val="center"/>
+          </w:tcPr>
+          <w:p>
+            <w:pPr>
+              <w:jc w:val="left"/>
+            </w:pPr>
+            <w:r/>
+            <w:r>
+              <w:rPr>
+                <w:rFonts w:ascii="Calibri" w:hAnsi="Calibri"/>
+                <w:color w:val="333333"/>
+                <w:sz w:val="13"/>
+              </w:rPr>
+              <w:t>Direct IdentityDbContext in handlers</w:t>
+            </w:r>
+          </w:p>
+        </w:tc>
+        <w:tc>
+          <w:tcPr>
+            <w:tcW w:type="dxa" w:w="4032"/>
+            <w:vAlign w:val="center"/>
+          </w:tcPr>
+          <w:p>
+            <w:pPr>
+              <w:jc w:val="left"/>
+            </w:pPr>
+            <w:r/>
+            <w:r>
+              <w:rPr>
+                <w:rFonts w:ascii="Calibri" w:hAnsi="Calibri"/>
+                <w:color w:val="333333"/>
+                <w:sz w:val="13"/>
+              </w:rPr>
+              <w:t>IApplicationDbContext (DbSet&lt;User&gt; etc. + SaveChangesAsync) - mockable with Mock&lt;IApplicationDbContext&gt;</w:t>
+            </w:r>
+          </w:p>
+        </w:tc>
+      </w:tr>
+      <w:tr>
+        <w:tc>
+          <w:tcPr>
+            <w:tcW w:type="dxa" w:w="2016"/>
+            <w:vAlign w:val="center"/>
+          </w:tcPr>
+          <w:p>
+            <w:pPr>
+              <w:jc w:val="left"/>
+            </w:pPr>
+            <w:r/>
+            <w:r>
+              <w:rPr>
+                <w:rFonts w:ascii="Calibri" w:hAnsi="Calibri"/>
+                <w:b/>
+                <w:color w:val="333333"/>
+                <w:sz w:val="13"/>
+              </w:rPr>
+              <w:t>Jwt</w:t>
+            </w:r>
+          </w:p>
+        </w:tc>
+        <w:tc>
+          <w:tcPr>
+            <w:tcW w:type="dxa" w:w="2592"/>
+            <w:vAlign w:val="center"/>
+          </w:tcPr>
+          <w:p>
+            <w:pPr>
+              <w:jc w:val="left"/>
+            </w:pPr>
+            <w:r/>
+            <w:r>
+              <w:rPr>
+                <w:rFonts w:ascii="Calibri" w:hAnsi="Calibri"/>
+                <w:color w:val="333333"/>
+                <w:sz w:val="13"/>
+              </w:rPr>
+              <w:t>Concrete JwtProvider</w:t>
+            </w:r>
+          </w:p>
+        </w:tc>
+        <w:tc>
+          <w:tcPr>
+            <w:tcW w:type="dxa" w:w="4032"/>
+            <w:vAlign w:val="center"/>
+          </w:tcPr>
+          <w:p>
+            <w:pPr>
+              <w:jc w:val="left"/>
+            </w:pPr>
+            <w:r/>
+            <w:r>
+              <w:rPr>
+                <w:rFonts w:ascii="Calibri" w:hAnsi="Calibri"/>
+                <w:color w:val="333333"/>
+                <w:sz w:val="13"/>
+              </w:rPr>
+              <w:t>IJwtProvider - mockable, test fixed token</w:t>
+            </w:r>
+          </w:p>
+        </w:tc>
+      </w:tr>
+      <w:tr>
+        <w:tc>
+          <w:tcPr>
+            <w:tcW w:type="dxa" w:w="2016"/>
+            <w:vAlign w:val="center"/>
+          </w:tcPr>
+          <w:p>
+            <w:pPr>
+              <w:jc w:val="left"/>
+            </w:pPr>
+            <w:r/>
+            <w:r>
+              <w:rPr>
+                <w:rFonts w:ascii="Calibri" w:hAnsi="Calibri"/>
+                <w:b/>
+                <w:color w:val="333333"/>
+                <w:sz w:val="13"/>
+              </w:rPr>
+              <w:t>Password</w:t>
+            </w:r>
+          </w:p>
+        </w:tc>
+        <w:tc>
+          <w:tcPr>
+            <w:tcW w:type="dxa" w:w="2592"/>
+            <w:vAlign w:val="center"/>
+          </w:tcPr>
+          <w:p>
+            <w:pPr>
+              <w:jc w:val="left"/>
+            </w:pPr>
+            <w:r/>
+            <w:r>
+              <w:rPr>
+                <w:rFonts w:ascii="Calibri" w:hAnsi="Calibri"/>
+                <w:color w:val="333333"/>
+                <w:sz w:val="13"/>
+              </w:rPr>
+              <w:t>static PasswordHasher</w:t>
+            </w:r>
+          </w:p>
+        </w:tc>
+        <w:tc>
+          <w:tcPr>
+            <w:tcW w:type="dxa" w:w="4032"/>
+            <w:vAlign w:val="center"/>
+          </w:tcPr>
+          <w:p>
+            <w:pPr>
+              <w:jc w:val="left"/>
+            </w:pPr>
+            <w:r/>
+            <w:r>
+              <w:rPr>
+                <w:rFonts w:ascii="Calibri" w:hAnsi="Calibri"/>
+                <w:color w:val="333333"/>
+                <w:sz w:val="13"/>
+              </w:rPr>
+              <w:t>IPasswordHasher instance : IPasswordHasher - DIP, testable</w:t>
+            </w:r>
+          </w:p>
+        </w:tc>
+      </w:tr>
+      <w:tr>
+        <w:tc>
+          <w:tcPr>
+            <w:tcW w:type="dxa" w:w="2016"/>
+            <w:vAlign w:val="center"/>
+          </w:tcPr>
+          <w:p>
+            <w:pPr>
+              <w:jc w:val="left"/>
+            </w:pPr>
+            <w:r/>
+            <w:r>
+              <w:rPr>
+                <w:rFonts w:ascii="Calibri" w:hAnsi="Calibri"/>
+                <w:b/>
+                <w:color w:val="333333"/>
+                <w:sz w:val="13"/>
+              </w:rPr>
+              <w:t>Refresh</w:t>
+            </w:r>
+          </w:p>
+        </w:tc>
+        <w:tc>
+          <w:tcPr>
+            <w:tcW w:type="dxa" w:w="2592"/>
+            <w:vAlign w:val="center"/>
+          </w:tcPr>
+          <w:p>
+            <w:pPr>
+              <w:jc w:val="left"/>
+            </w:pPr>
+            <w:r/>
+            <w:r>
+              <w:rPr>
+                <w:rFonts w:ascii="Calibri" w:hAnsi="Calibri"/>
+                <w:color w:val="333333"/>
+                <w:sz w:val="13"/>
+              </w:rPr>
+              <w:t>Concrete RefreshTokenService(IdentityDbContext)</w:t>
+            </w:r>
+          </w:p>
+        </w:tc>
+        <w:tc>
+          <w:tcPr>
+            <w:tcW w:type="dxa" w:w="4032"/>
+            <w:vAlign w:val="center"/>
+          </w:tcPr>
+          <w:p>
+            <w:pPr>
+              <w:jc w:val="left"/>
+            </w:pPr>
+            <w:r/>
+            <w:r>
+              <w:rPr>
+                <w:rFonts w:ascii="Calibri" w:hAnsi="Calibri"/>
+                <w:color w:val="333333"/>
+                <w:sz w:val="13"/>
+              </w:rPr>
+              <w:t>IRefreshTokenService : Depends on IApplicationDbContext, HashToken instance</w:t>
+            </w:r>
+          </w:p>
+        </w:tc>
+      </w:tr>
+      <w:tr>
+        <w:tc>
+          <w:tcPr>
+            <w:tcW w:type="dxa" w:w="2016"/>
+            <w:vAlign w:val="center"/>
+          </w:tcPr>
+          <w:p>
+            <w:pPr>
+              <w:jc w:val="left"/>
+            </w:pPr>
+            <w:r/>
+            <w:r>
+              <w:rPr>
+                <w:rFonts w:ascii="Calibri" w:hAnsi="Calibri"/>
+                <w:b/>
+                <w:color w:val="333333"/>
+                <w:sz w:val="13"/>
+              </w:rPr>
+              <w:t>Email</w:t>
+            </w:r>
+          </w:p>
+        </w:tc>
+        <w:tc>
+          <w:tcPr>
+            <w:tcW w:type="dxa" w:w="2592"/>
+            <w:vAlign w:val="center"/>
+          </w:tcPr>
+          <w:p>
+            <w:pPr>
+              <w:jc w:val="left"/>
+            </w:pPr>
+            <w:r/>
+            <w:r>
+              <w:rPr>
+                <w:rFonts w:ascii="Calibri" w:hAnsi="Calibri"/>
+                <w:color w:val="333333"/>
+                <w:sz w:val="13"/>
+              </w:rPr>
+              <w:t>BrevoEmailService concrete</w:t>
+            </w:r>
+          </w:p>
+        </w:tc>
+        <w:tc>
+          <w:tcPr>
+            <w:tcW w:type="dxa" w:w="4032"/>
+            <w:vAlign w:val="center"/>
+          </w:tcPr>
+          <w:p>
+            <w:pPr>
+              <w:jc w:val="left"/>
+            </w:pPr>
+            <w:r/>
+            <w:r>
+              <w:rPr>
+                <w:rFonts w:ascii="Calibri" w:hAnsi="Calibri"/>
+                <w:color w:val="333333"/>
+                <w:sz w:val="13"/>
+              </w:rPr>
+              <w:t>IBrevoEmailService interface + BrevoEmailService : IBrevoEmailService, AddHttpClient&lt;IBrevoEmailService, BrevoEmailService&gt;()</w:t>
+            </w:r>
+          </w:p>
+        </w:tc>
+      </w:tr>
+      <w:tr>
+        <w:tc>
+          <w:tcPr>
+            <w:tcW w:type="dxa" w:w="2016"/>
+            <w:vAlign w:val="center"/>
+          </w:tcPr>
+          <w:p>
+            <w:pPr>
+              <w:jc w:val="left"/>
+            </w:pPr>
+            <w:r/>
+            <w:r>
+              <w:rPr>
+                <w:rFonts w:ascii="Calibri" w:hAnsi="Calibri"/>
+                <w:b/>
+                <w:color w:val="333333"/>
+                <w:sz w:val="13"/>
+              </w:rPr>
+              <w:t>Workspace Invite</w:t>
+            </w:r>
+          </w:p>
+        </w:tc>
+        <w:tc>
+          <w:tcPr>
+            <w:tcW w:type="dxa" w:w="2592"/>
+            <w:vAlign w:val="center"/>
+          </w:tcPr>
+          <w:p>
+            <w:pPr>
+              <w:jc w:val="left"/>
+            </w:pPr>
+            <w:r/>
+            <w:r>
+              <w:rPr>
+                <w:rFonts w:ascii="Calibri" w:hAnsi="Calibri"/>
+                <w:color w:val="333333"/>
+                <w:sz w:val="13"/>
+              </w:rPr>
+              <w:t>Only workspace invite in Identity (OrgAdmin)</w:t>
+            </w:r>
+          </w:p>
+        </w:tc>
+        <w:tc>
+          <w:tcPr>
+            <w:tcW w:type="dxa" w:w="4032"/>
+            <w:vAlign w:val="center"/>
+          </w:tcPr>
+          <w:p>
+            <w:pPr>
+              <w:jc w:val="left"/>
+            </w:pPr>
+            <w:r/>
+            <w:r>
+              <w:rPr>
+                <w:rFonts w:ascii="Calibri" w:hAnsi="Calibri"/>
+                <w:color w:val="333333"/>
+                <w:sz w:val="13"/>
+              </w:rPr>
+              <w:t>Keep workspace invite in Identity (OrgAdmin) + ADD project invite in Project Service (PM + OrgAdmin) in Phase 2 (Task 2.x) - systematic per task logs</w:t>
+            </w:r>
+          </w:p>
+        </w:tc>
+      </w:tr>
+      <w:tr>
+        <w:tc>
+          <w:tcPr>
+            <w:tcW w:type="dxa" w:w="2016"/>
+            <w:vAlign w:val="center"/>
+          </w:tcPr>
+          <w:p>
+            <w:pPr>
+              <w:jc w:val="left"/>
+            </w:pPr>
+            <w:r/>
+            <w:r>
+              <w:rPr>
+                <w:rFonts w:ascii="Calibri" w:hAnsi="Calibri"/>
+                <w:b/>
+                <w:color w:val="333333"/>
+                <w:sz w:val="13"/>
+              </w:rPr>
+              <w:t>Rich Domain</w:t>
+            </w:r>
+          </w:p>
+        </w:tc>
+        <w:tc>
+          <w:tcPr>
+            <w:tcW w:type="dxa" w:w="2592"/>
+            <w:vAlign w:val="center"/>
+          </w:tcPr>
+          <w:p>
+            <w:pPr>
+              <w:jc w:val="left"/>
+            </w:pPr>
+            <w:r/>
+            <w:r>
+              <w:rPr>
+                <w:rFonts w:ascii="Calibri" w:hAnsi="Calibri"/>
+                <w:color w:val="333333"/>
+                <w:sz w:val="13"/>
+              </w:rPr>
+              <w:t>Entities with methods (UpdateProfile, Deactivate) - already Rich</w:t>
+            </w:r>
+          </w:p>
+        </w:tc>
+        <w:tc>
+          <w:tcPr>
+            <w:tcW w:type="dxa" w:w="4032"/>
+            <w:vAlign w:val="center"/>
+          </w:tcPr>
+          <w:p>
+            <w:pPr>
+              <w:jc w:val="left"/>
+            </w:pPr>
+            <w:r/>
+            <w:r>
+              <w:rPr>
+                <w:rFonts w:ascii="Calibri" w:hAnsi="Calibri"/>
+                <w:color w:val="333333"/>
+                <w:sz w:val="13"/>
+              </w:rPr>
+              <w:t>Kept Rich Domain (DDD) - User.UpdateProfile, Organization.Update, RefreshToken.Revoke encapsulate invariants + Touch()</w:t>
+            </w:r>
+          </w:p>
+        </w:tc>
+      </w:tr>
+      <w:tr>
+        <w:tc>
+          <w:tcPr>
+            <w:tcW w:type="dxa" w:w="2016"/>
+            <w:vAlign w:val="center"/>
+          </w:tcPr>
+          <w:p>
+            <w:pPr>
+              <w:jc w:val="left"/>
+            </w:pPr>
+            <w:r/>
+            <w:r>
+              <w:rPr>
+                <w:rFonts w:ascii="Calibri" w:hAnsi="Calibri"/>
+                <w:b/>
+                <w:color w:val="333333"/>
+                <w:sz w:val="13"/>
+              </w:rPr>
+              <w:t>IAggregateRoot</w:t>
+            </w:r>
+          </w:p>
+        </w:tc>
+        <w:tc>
+          <w:tcPr>
+            <w:tcW w:type="dxa" w:w="2592"/>
+            <w:vAlign w:val="center"/>
+          </w:tcPr>
+          <w:p>
+            <w:pPr>
+              <w:jc w:val="left"/>
+            </w:pPr>
+            <w:r/>
+            <w:r>
+              <w:rPr>
+                <w:rFonts w:ascii="Calibri" w:hAnsi="Calibri"/>
+                <w:color w:val="333333"/>
+                <w:sz w:val="13"/>
+              </w:rPr>
+              <w:t>Marker interface empty</w:t>
+            </w:r>
+          </w:p>
+        </w:tc>
+        <w:tc>
+          <w:tcPr>
+            <w:tcW w:type="dxa" w:w="4032"/>
+            <w:vAlign w:val="center"/>
+          </w:tcPr>
+          <w:p>
+            <w:pPr>
+              <w:jc w:val="left"/>
+            </w:pPr>
+            <w:r/>
+            <w:r>
+              <w:rPr>
+                <w:rFonts w:ascii="Calibri" w:hAnsi="Calibri"/>
+                <w:color w:val="333333"/>
+                <w:sz w:val="13"/>
+              </w:rPr>
+              <w:t>Kept - marks User/Organization/Project as roots, only roots have repositories (IRepository&lt;T&gt; where T:IAggregateRoot)</w:t>
+            </w:r>
+          </w:p>
+        </w:tc>
+      </w:tr>
+      <w:tr>
+        <w:tc>
+          <w:tcPr>
+            <w:tcW w:type="dxa" w:w="2016"/>
+            <w:vAlign w:val="center"/>
+          </w:tcPr>
+          <w:p>
+            <w:pPr>
+              <w:jc w:val="left"/>
+            </w:pPr>
+            <w:r/>
+            <w:r>
+              <w:rPr>
+                <w:rFonts w:ascii="Calibri" w:hAnsi="Calibri"/>
+                <w:b/>
+                <w:color w:val="333333"/>
+                <w:sz w:val="13"/>
+              </w:rPr>
+              <w:t>BuildHost</w:t>
+            </w:r>
+          </w:p>
+        </w:tc>
+        <w:tc>
+          <w:tcPr>
+            <w:tcW w:type="dxa" w:w="2592"/>
+            <w:vAlign w:val="center"/>
+          </w:tcPr>
+          <w:p>
+            <w:pPr>
+              <w:jc w:val="left"/>
+            </w:pPr>
+            <w:r/>
+            <w:r>
+              <w:rPr>
+                <w:rFonts w:ascii="Calibri" w:hAnsi="Calibri"/>
+                <w:color w:val="333333"/>
+                <w:sz w:val="13"/>
+              </w:rPr>
+              <w:t>Not explained</w:t>
+            </w:r>
+          </w:p>
+        </w:tc>
+        <w:tc>
+          <w:tcPr>
+            <w:tcW w:type="dxa" w:w="4032"/>
+            <w:vAlign w:val="center"/>
+          </w:tcPr>
+          <w:p>
+            <w:pPr>
+              <w:jc w:val="left"/>
+            </w:pPr>
+            <w:r/>
+            <w:r>
+              <w:rPr>
+                <w:rFonts w:ascii="Calibri" w:hAnsi="Calibri"/>
+                <w:color w:val="333333"/>
+                <w:sz w:val="13"/>
+              </w:rPr>
+              <w:t>EF Core 10 BuildHost-net472/netcore in obj/ auto-generated by dotnet ef (design-time host, gitignored, not your code) - visible in .NET 10 vs older EF where hidden</w:t>
+            </w:r>
+          </w:p>
+        </w:tc>
+      </w:tr>
+      <w:tr>
+        <w:tc>
+          <w:tcPr>
+            <w:tcW w:type="dxa" w:w="2016"/>
+            <w:vAlign w:val="center"/>
+          </w:tcPr>
+          <w:p>
+            <w:pPr>
+              <w:jc w:val="left"/>
+            </w:pPr>
+            <w:r/>
+            <w:r>
+              <w:rPr>
+                <w:rFonts w:ascii="Calibri" w:hAnsi="Calibri"/>
+                <w:b/>
+                <w:color w:val="333333"/>
+                <w:sz w:val="13"/>
+              </w:rPr>
+              <w:t>Angular CSS</w:t>
+            </w:r>
+          </w:p>
+        </w:tc>
+        <w:tc>
+          <w:tcPr>
+            <w:tcW w:type="dxa" w:w="2592"/>
+            <w:vAlign w:val="center"/>
+          </w:tcPr>
+          <w:p>
+            <w:pPr>
+              <w:jc w:val="left"/>
+            </w:pPr>
+            <w:r/>
+            <w:r>
+              <w:rPr>
+                <w:rFonts w:ascii="Calibri" w:hAnsi="Calibri"/>
+                <w:color w:val="333333"/>
+                <w:sz w:val="13"/>
+              </w:rPr>
+              <w:t>Possible internal CSS</w:t>
+            </w:r>
+          </w:p>
+        </w:tc>
+        <w:tc>
+          <w:tcPr>
+            <w:tcW w:type="dxa" w:w="4032"/>
+            <w:vAlign w:val="center"/>
+          </w:tcPr>
+          <w:p>
+            <w:pPr>
+              <w:jc w:val="left"/>
+            </w:pPr>
+            <w:r/>
+            <w:r>
+              <w:rPr>
+                <w:rFonts w:ascii="Calibri" w:hAnsi="Calibri"/>
+                <w:color w:val="333333"/>
+                <w:sz w:val="13"/>
+              </w:rPr>
+              <w:t>Enforced style: none via angular.json schematics - all styling via Tailwind + DaisyUI global utilities, no component CSS</w:t>
+            </w:r>
+          </w:p>
+        </w:tc>
+      </w:tr>
+      <w:tr>
+        <w:tc>
+          <w:tcPr>
+            <w:tcW w:type="dxa" w:w="2016"/>
+            <w:vAlign w:val="center"/>
+          </w:tcPr>
+          <w:p>
+            <w:pPr>
+              <w:jc w:val="left"/>
+            </w:pPr>
+            <w:r/>
+            <w:r>
+              <w:rPr>
+                <w:rFonts w:ascii="Calibri" w:hAnsi="Calibri"/>
+                <w:b/>
+                <w:color w:val="333333"/>
+                <w:sz w:val="13"/>
+              </w:rPr>
+              <w:t>DB</w:t>
+            </w:r>
+          </w:p>
+        </w:tc>
+        <w:tc>
+          <w:tcPr>
+            <w:tcW w:type="dxa" w:w="2592"/>
+            <w:vAlign w:val="center"/>
+          </w:tcPr>
+          <w:p>
+            <w:pPr>
+              <w:jc w:val="left"/>
+            </w:pPr>
+            <w:r/>
+            <w:r>
+              <w:rPr>
+                <w:rFonts w:ascii="Calibri" w:hAnsi="Calibri"/>
+                <w:color w:val="333333"/>
+                <w:sz w:val="13"/>
+              </w:rPr>
+              <w:t>Separate DBs per service (flowboard_identity...)</w:t>
+            </w:r>
+          </w:p>
+        </w:tc>
+        <w:tc>
+          <w:tcPr>
+            <w:tcW w:type="dxa" w:w="4032"/>
+            <w:vAlign w:val="center"/>
+          </w:tcPr>
+          <w:p>
+            <w:pPr>
+              <w:jc w:val="left"/>
+            </w:pPr>
+            <w:r/>
+            <w:r>
+              <w:rPr>
+                <w:rFonts w:ascii="Calibri" w:hAnsi="Calibri"/>
+                <w:color w:val="333333"/>
+                <w:sz w:val="13"/>
+              </w:rPr>
+              <w:t>Single DB flowboard with 4 schemas [identity], [project], [file], [notification] on Server=localhost (as per SDD 7)</w:t>
+            </w:r>
+          </w:p>
+        </w:tc>
+      </w:tr>
+    </w:tbl>
+    <w:p>
+      <w:pPr>
+        <w:spacing w:after="80"/>
+      </w:pPr>
+    </w:p>
+    <w:p>
+      <w:pPr>
+        <w:pStyle w:val="Heading2"/>
+      </w:pPr>
+      <w:r>
+        <w:rPr>
+          <w:rFonts w:ascii="Calibri" w:hAnsi="Calibri"/>
+          <w:b/>
+          <w:color w:val="4472C4"/>
+          <w:sz w:val="22"/>
+        </w:rPr>
+        <w:t>Workspace vs Project and User Claims Clarification</w:t>
+      </w:r>
+    </w:p>
+    <w:p>
+      <w:r>
+        <w:rPr>
+          <w:rFonts w:ascii="Calibri" w:hAnsi="Calibri"/>
+          <w:sz w:val="15"/>
+        </w:rPr>
+        <w:t>User property in Controllers: ControllerBase.User (ClaimsPrincipal) from Microsoft.AspNetCore.Mvc, not an import. Set by JwtBearer middleware after validating Authorization: Bearer &lt;token&gt; (JwtProvider 15m token with claims sub, email, workspace_id, Role). User.FindFirstValue(ClaimTypes.NameIdentifier) reads sub claim. Workspace (e.g., Engineering) -&gt; contains Projects (e.g., Mobile App Redesign MAR, FlowBoard Demo FB-3). Workspace invite (OrgAdmin, Identity Service) adds to identity.WorkspaceMembers (sees all projects). Project invite (PM + OrgAdmin, Project Service, Phase 2) will add to project.ProjectMembers (sees only that project) with Brevo template 'You've been added to project MAR'. Same IBrevoEmailService interface, different template.</w:t>
+      </w:r>
+    </w:p>
     <w:sectPr>
       <w:footerReference w:type="default" r:id="rId9"/>
       <w:pgSz w:w="12240" w:h="15840"/>
@@ -25141,7 +26043,7 @@
         <w:color w:val="808080"/>
         <w:sz w:val="14"/>
       </w:rPr>
-      <w:t xml:space="preserve">FlowBoard SDD v1.2  •  Angular 22 + .NET 10 + TanStack + Signals  •  Prashant Kumar Verma  •  </w:t>
+      <w:t xml:space="preserve">FlowBoard SDD v1.3  •  Angular 22 + .NET 10 + TanStack + Signals  •  Prashant Kumar Verma  •  </w:t>
     </w:r>
   </w:p>
 </w:ftr>

</xml_diff>

<commit_message>
docs: update system design + tasks plan + log for company-centric redesign (Appendix X + Phase 6 tasks 6.1-6.5 + Task 6.0 completed)
- System Design Appendix X: SuperAdmin global, company-centric register, OrganizationMembers vs WorkspaceMembers explicit, custom OrganizationWorkspaceRoles, 24 permissions matrix, org vs project activity split, task assignee intersection, sidebar visibility
- Tasks Plan Phase 6: 6.1 OrganizationMembers/Custom Roles DB, 6.2 Permissions catalog, 6.3 Org Activities, 6.4 Roles CRUD UI, 6.5 Assignee/Activity
- TASK_LOG: Progress 15/31 (Phase 5 0/5 + Phase 6 0/5), add Task 6.0 completed + 5.5 future admin dashboard
</commit_message>
<xml_diff>
--- a/Documents/FlowBoard_System_Design.docx
+++ b/Documents/FlowBoard_System_Design.docx
@@ -26017,6 +26017,123 @@
           <w:sz w:val="15"/>
         </w:rPr>
         <w:t>User property in Controllers: ControllerBase.User (ClaimsPrincipal) from Microsoft.AspNetCore.Mvc, not an import. Set by JwtBearer middleware after validating Authorization: Bearer &lt;token&gt; (JwtProvider 15m token with claims sub, email, workspace_id, Role). User.FindFirstValue(ClaimTypes.NameIdentifier) reads sub claim. Workspace (e.g., Engineering) -&gt; contains Projects (e.g., Mobile App Redesign MAR, FlowBoard Demo FB-3). Workspace invite (OrgAdmin, Identity Service) adds to identity.WorkspaceMembers (sees all projects). Project invite (PM + OrgAdmin, Project Service, Phase 2) will add to project.ProjectMembers (sees only that project) with Brevo template 'You've been added to project MAR'. Same IBrevoEmailService interface, different template.</w:t>
+      </w:r>
+    </w:p>
+    <w:p>
+      <w:pPr>
+        <w:pStyle w:val="Heading1"/>
+      </w:pPr>
+      <w:r>
+        <w:t>Appendix X — Company-Centric Organization Redesign (2026-09-09) — MNC Grade</w:t>
+      </w:r>
+    </w:p>
+    <w:p>
+      <w:r>
+        <w:t>This appendix replaces the previous personal-org model. New session must read this first. All future code must follow this.</w:t>
+      </w:r>
+    </w:p>
+    <w:p>
+      <w:pPr>
+        <w:pStyle w:val="Heading2"/>
+      </w:pPr>
+      <w:r>
+        <w:t>X.1 SuperAdmin (System Owner)</w:t>
+      </w:r>
+    </w:p>
+    <w:p>
+      <w:r>
+        <w:t>SuperAdmin (WorkspaceRole=5) is global SaaS owner, stored as Users.IsSuperAdmin=true, not in OrganizationMembers. Only 1 seeded: superadmin@flowboard.local / Super666@lmp with Organization FlowBoard System + Workspace System (SuperAdmin). SuperAdmin has full authority to delete any organization/member via /admin (future), cannot impersonate OrgAdmin — must register separate OrgAdmin account with different email for tenant access.</w:t>
+      </w:r>
+    </w:p>
+    <w:p>
+      <w:pPr>
+        <w:pStyle w:val="Heading2"/>
+      </w:pPr>
+      <w:r>
+        <w:t>X.2 Company-Centric Register (No Personal Org)</w:t>
+      </w:r>
+    </w:p>
+    <w:p>
+      <w:r>
+        <w:t>Register collects FullName, Email, Password, Company Name (+Description optional). Backend AuthService.RegisterAsync creates Organization(companyName, OwnerId=registrant) + Workspace General + OrganizationMembers(OrgAdmin) + WorkspaceMembers(General, Member default). No personal org. Employee cannot self-register; only OrgAdmin creates via Organization Members.</w:t>
+      </w:r>
+    </w:p>
+    <w:p>
+      <w:pPr>
+        <w:pStyle w:val="Heading2"/>
+      </w:pPr>
+      <w:r>
+        <w:t>X.3 OrganizationMembers vs WorkspaceMembers (Explicit)</w:t>
+      </w:r>
+    </w:p>
+    <w:p>
+      <w:r>
+        <w:t>New tables: [identity].OrganizationMembers(Id, OrganizationId FK, UserId FK, Role int 0=Member/2=OrgAdmin/3=Client, JoinedAt, Unique Org+User) — org-level 3 roles, explicit. [identity].WorkspaceMembers(WorkspaceId, UserId, CustomRoleId FK nullable) — per-workspace, allows same user ProjectManager in General and Viewer in Engineering. Organization role OrgAdmin implicitly has all workspace permissions in that org.</w:t>
+      </w:r>
+    </w:p>
+    <w:p>
+      <w:pPr>
+        <w:pStyle w:val="Heading2"/>
+      </w:pPr>
+      <w:r>
+        <w:t>X.4 Custom Workspace Roles per Organization</w:t>
+      </w:r>
+    </w:p>
+    <w:p>
+      <w:r>
+        <w:t>New table [identity].OrganizationWorkspaceRoles(Id, OrganizationId FK, Name 100 unique per org, Description, CreatedBy, CreatedAt). OrgAdmin creates via Main Sidebar Roles (OrgAdmin/SuperAdmin only) with table + Add/Edit modals, Delete with confirmation modal. If no roles, Add Employee shows warning but org-only create still allowed. Roles page separate from Members.</w:t>
+      </w:r>
+    </w:p>
+    <w:p>
+      <w:pPr>
+        <w:pStyle w:val="Heading2"/>
+      </w:pPr>
+      <w:r>
+        <w:t>X.5 Permissions Matrix (24 Permissions)</w:t>
+      </w:r>
+    </w:p>
+    <w:p>
+      <w:r>
+        <w:t>Fixed catalog seeded in [identity].Permissions(Id, Key, Name, Group): org:view/update/delete, workspace:view/create/update/delete, project:view/create/update/delete, board:view/create/update/delete, sprint:view/create/update/delete, task:view/create/update/delete/move/assign, subtask:view/create/update/delete, comment:view/create/update/delete, team:view/create/update/delete, member:view/add/remove, activity:view:org, activity:view:project, role:view/manage. Join table [identity].RolePermissions(RoleId, PermissionId). OrgAdmin has implicit all org. SuperAdmin bypasses.</w:t>
+      </w:r>
+    </w:p>
+    <w:p>
+      <w:pPr>
+        <w:pStyle w:val="Heading2"/>
+      </w:pPr>
+      <w:r>
+        <w:t>X.6 Activity Split (Org vs Project)</w:t>
+      </w:r>
+    </w:p>
+    <w:p>
+      <w:r>
+        <w:t>Two tables: [identity].OrganizationActivities(Id, OrganizationId, ActorUserId, Action, PayloadJson, OccurredOn) — for org events (OrgCreated, MemberAdded, RoleCreated, PermissionUpdated). [project].ActivityLogs extended with WorkspaceId nullable — for project events (TaskCreated, BoardCreated). APIs: GET /api/organizations/{orgId}/activities and GET /api/projects/{pid}/activities. Main sidebar Activity org-level visible OrgAdmin only; Project sidebar Activity visible all project members.</w:t>
+      </w:r>
+    </w:p>
+    <w:p>
+      <w:pPr>
+        <w:pStyle w:val="Heading2"/>
+      </w:pPr>
+      <w:r>
+        <w:t>X.7 Task Assignee Rule</w:t>
+      </w:r>
+    </w:p>
+    <w:p>
+      <w:r>
+        <w:t>Task assignee dropdown = intersection of OrganizationMembers in org AND WorkspaceMembers in that workspace AND ProjectMembers in that project. Guarantees never cross-org.</w:t>
+      </w:r>
+    </w:p>
+    <w:p>
+      <w:pPr>
+        <w:pStyle w:val="Heading2"/>
+      </w:pPr>
+      <w:r>
+        <w:t>X.8 Main vs Project Sidebar Visibility</w:t>
+      </w:r>
+    </w:p>
+    <w:p>
+      <w:r>
+        <w:t>Main sidebar: Dashboard/Workspaces/Projects visible all; Activity/Members/System visible OrgAdmin/SuperAdmin only; Organization Overview Edit button visible OrgAdmin only. Project sidebar: all 11 items visible to Member.</w:t>
       </w:r>
     </w:p>
     <w:sectPr>

</xml_diff>